<commit_message>
fix: separate memo control notes and preserve supplied signer fields
Keep explicit control notes outside signed content, preserve anonymous supplied signer and position aliases, reject conflicting fields, and verify visible errors/non-memo button exclusion in mobile and desktop. Add evidence without reducing assertions or calling AI.
</commit_message>
<xml_diff>
--- a/docs/quality/pr347/sample.docx
+++ b/docs/quality/pr347/sample.docx
@@ -18,7 +18,7 @@
         <w:rPr>
           <w:lang w:val="th-TH"/>
         </w:rPr>
-        <w:t xml:space="preserve">ส่วนราชการ  [รอตรวจสอบ]</w:t>
+        <w:t xml:space="preserve">ส่วนราชการ  หน่วยงานตัวอย่าง</w:t>
       </w:r>
     </w:p>
     <w:p>
@@ -26,7 +26,7 @@
         <w:rPr>
           <w:lang w:val="th-TH"/>
         </w:rPr>
-        <w:t xml:space="preserve">ที่  ทดสอบ 21/2569</w:t>
+        <w:t xml:space="preserve">ที่  ทดสอบ 1/2569</w:t>
       </w:r>
     </w:p>
     <w:p>
@@ -88,8 +88,8 @@
         <w:rPr>
           <w:lang w:val="th-TH"/>
         </w:rPr>
-        <w:t xml:space="preserve">กิจกรรมจำลอง 21 วันที่ 5 พฤศจิกายน 2569
-ผู้เข้าร่วม 30 คน เวลา 09.00–12.00 น.</w:t>
+        <w:t xml:space="preserve">กิจกรรมจำลอง 1 วันที่ 5 พฤศจิกายน 2569
+ผู้เข้าร่วม 10 คน เวลา 09.00–12.00 น.</w:t>
       </w:r>
     </w:p>
     <w:p>
@@ -143,7 +143,7 @@
         <w:rPr>
           <w:lang w:val="th-TH"/>
         </w:rPr>
-        <w:t xml:space="preserve">([รอตรวจสอบ])</w:t>
+        <w:t xml:space="preserve">([ชื่อจำลอง])</w:t>
       </w:r>
     </w:p>
     <w:p>
@@ -151,7 +151,7 @@
         <w:rPr>
           <w:lang w:val="th-TH"/>
         </w:rPr>
-        <w:t xml:space="preserve">ตำแหน่ง [รอตรวจสอบ]</w:t>
+        <w:t xml:space="preserve">ตำแหน่ง หัวหน้าหน่วยงานตัวอย่าง</w:t>
       </w:r>
     </w:p>
     <w:sectPr>

</xml_diff>